<commit_message>
v4.1: #32规则收口——C5/M1/D1时序唯一化+Closure evidence contract表+C1 full/summary双输出+P70机器输出contract+old40默认/例外口径统一（响应Data-R review f363615）
</commit_message>
<xml_diff>
--- a/麒麟OS_Agent_Memory_Data_v4.1_新人AI闭环执行SOP.docx
+++ b/麒麟OS_Agent_Memory_Data_v4.1_新人AI闭环执行SOP.docx
@@ -1376,6 +1376,19 @@
         </w:rPr>
         <w:t>C0 Human Independence PASS</w:t>
         <w:br/>
+        <w:t xml:space="preserve"> -&gt; C1 Legacy Inventory FROZEN</w:t>
+        <w:br/>
+        <w:t xml:space="preserve"> -&gt; C2 Existing Seal Audited / revoked if needed</w:t>
+        <w:br/>
+        <w:t xml:space="preserve"> -&gt; C3 P2-A Tooling READY</w:t>
+        <w:br/>
+        <w:t xml:space="preserve"> -&gt; C4 PR31 trial40 = HISTORY_ONLY / fresh40 plan</w:t>
+        <w:br/>
+        <w:t xml:space="preserve"> -&gt; C5 Main dependency plan registered</w:t>
+        <w:br/>
+        <w:t xml:space="preserve"> -&gt; Data-R Closure Freeze</w:t>
+        <w:br/>
+        <w:t xml:space="preserve"> -&gt; START FORMAL DAY 1</w:t>
       </w:r>
       <w:r>
         <w:rPr>
@@ -1383,8 +1396,6 @@
           <w:b w:val="0"/>
           <w:sz w:val="16"/>
         </w:rPr>
-        <w:t xml:space="preserve"> -&gt; C1 Legacy Inventory FROZEN</w:t>
-        <w:br/>
       </w:r>
       <w:r>
         <w:rPr>
@@ -1392,8 +1403,6 @@
           <w:b w:val="0"/>
           <w:sz w:val="16"/>
         </w:rPr>
-        <w:t xml:space="preserve"> -&gt; C2 Existing Seal Audited / revoked if needed</w:t>
-        <w:br/>
       </w:r>
       <w:r>
         <w:rPr>
@@ -1401,8 +1410,6 @@
           <w:b w:val="0"/>
           <w:sz w:val="16"/>
         </w:rPr>
-        <w:t xml:space="preserve"> -&gt; C3 P2-A Tooling READY</w:t>
-        <w:br/>
       </w:r>
       <w:r>
         <w:rPr>
@@ -1410,8 +1417,6 @@
           <w:b w:val="0"/>
           <w:sz w:val="16"/>
         </w:rPr>
-        <w:t xml:space="preserve"> -&gt; C4 PR31 trial40 = HISTORY_ONLY / fresh40 plan</w:t>
-        <w:br/>
       </w:r>
       <w:r>
         <w:rPr>
@@ -1419,8 +1424,6 @@
           <w:b w:val="0"/>
           <w:sz w:val="16"/>
         </w:rPr>
-        <w:t xml:space="preserve"> -&gt; C5 Main dependency plan registered</w:t>
-        <w:br/>
       </w:r>
       <w:r>
         <w:rPr>
@@ -1428,7 +1431,6 @@
           <w:b w:val="0"/>
           <w:sz w:val="16"/>
         </w:rPr>
-        <w:t xml:space="preserve"> -&gt; START FORMAL DAY 1</w:t>
       </w:r>
     </w:p>
     <w:p>
@@ -1441,9 +1443,322 @@
           <w:b w:val="0"/>
           <w:sz w:val="20"/>
         </w:rPr>
-        <w:t>Closure 不等于必须等所有主仓 Runtime 完成才开始数据工作。它要求的是：依赖状态和安全并行路径明确。M1必须在D1前绿；M1-KB/M2/M3可以按截止时间推进，但未绿时系统必须保持 BLOCKED，而不是让新人和AI自行猜。</w:t>
+        <w:t>Closure 不等于必须等所有主仓 Runtime 完成才开始数据工作。它要求的是：依赖状态和安全并行路径明确。</w:t>
+        <w:br/>
+        <w:t>M1 最晚在 D1 10:30 PASS。M1 PASS 前只允许不依赖 production business truth 的 safe tasks；</w:t>
+        <w:br/>
+        <w:t>若 D1 10:30 仍未 PASS，相关 production Gold 工作 STOP/BLOCKED_MAIN_CONTRACT。</w:t>
+        <w:br/>
+        <w:t>M1-KB/M2/M3 按各自 deadline 推进，未绿部分继续 BLOCKED，不得伪造。</w:t>
       </w:r>
     </w:p>
+    <w:tbl>
+      <w:tblPr>
+        <w:tblStyle w:val="TableGrid"/>
+        <w:tblW w:type="auto" w:w="0"/>
+        <w:tblLook w:firstColumn="1" w:firstRow="1" w:lastColumn="0" w:lastRow="0" w:noHBand="0" w:noVBand="1" w:val="04A0"/>
+      </w:tblPr>
+      <w:tblGrid>
+        <w:gridCol w:w="2536"/>
+        <w:gridCol w:w="2536"/>
+        <w:gridCol w:w="2536"/>
+        <w:gridCol w:w="2536"/>
+      </w:tblGrid>
+      <w:tr>
+        <w:tc>
+          <w:tcPr>
+            <w:tcW w:type="dxa" w:w="2536"/>
+          </w:tcPr>
+          <w:p>
+            <w:r>
+              <w:t>Gate</w:t>
+            </w:r>
+          </w:p>
+        </w:tc>
+        <w:tc>
+          <w:tcPr>
+            <w:tcW w:type="dxa" w:w="2536"/>
+          </w:tcPr>
+          <w:p>
+            <w:r>
+              <w:t>Primary evidence</w:t>
+            </w:r>
+          </w:p>
+        </w:tc>
+        <w:tc>
+          <w:tcPr>
+            <w:tcW w:type="dxa" w:w="2536"/>
+          </w:tcPr>
+          <w:p>
+            <w:r>
+              <w:t>Supporting evidence</w:t>
+            </w:r>
+          </w:p>
+        </w:tc>
+        <w:tc>
+          <w:tcPr>
+            <w:tcW w:type="dxa" w:w="2536"/>
+          </w:tcPr>
+          <w:p>
+            <w:r>
+              <w:t>Signer</w:t>
+            </w:r>
+          </w:p>
+        </w:tc>
+      </w:tr>
+      <w:tr>
+        <w:tc>
+          <w:tcPr>
+            <w:tcW w:type="dxa" w:w="2536"/>
+          </w:tcPr>
+          <w:p>
+            <w:r>
+              <w:t>C0</w:t>
+            </w:r>
+          </w:p>
+        </w:tc>
+        <w:tc>
+          <w:tcPr>
+            <w:tcW w:type="dxa" w:w="2536"/>
+          </w:tcPr>
+          <w:p>
+            <w:r>
+              <w:t>independence_manifest.json</w:t>
+            </w:r>
+          </w:p>
+        </w:tc>
+        <w:tc>
+          <w:tcPr>
+            <w:tcW w:type="dxa" w:w="2536"/>
+          </w:tcPr>
+          <w:p>
+            <w:r>
+              <w:t>-</w:t>
+            </w:r>
+          </w:p>
+        </w:tc>
+        <w:tc>
+          <w:tcPr>
+            <w:tcW w:type="dxa" w:w="2536"/>
+          </w:tcPr>
+          <w:p>
+            <w:r>
+              <w:t>Data-R</w:t>
+            </w:r>
+          </w:p>
+        </w:tc>
+      </w:tr>
+      <w:tr>
+        <w:tc>
+          <w:tcPr>
+            <w:tcW w:type="dxa" w:w="2536"/>
+          </w:tcPr>
+          <w:p>
+            <w:r>
+              <w:t>C1</w:t>
+            </w:r>
+          </w:p>
+        </w:tc>
+        <w:tc>
+          <w:tcPr>
+            <w:tcW w:type="dxa" w:w="2536"/>
+          </w:tcPr>
+          <w:p>
+            <w:r>
+              <w:t>legacy_inventory_v4_full.jsonl</w:t>
+            </w:r>
+          </w:p>
+        </w:tc>
+        <w:tc>
+          <w:tcPr>
+            <w:tcW w:type="dxa" w:w="2536"/>
+          </w:tcPr>
+          <w:p>
+            <w:r>
+              <w:t>legacy_inventory_v4.json (summary)</w:t>
+            </w:r>
+          </w:p>
+        </w:tc>
+        <w:tc>
+          <w:tcPr>
+            <w:tcW w:type="dxa" w:w="2536"/>
+          </w:tcPr>
+          <w:p>
+            <w:r>
+              <w:t>Data-R</w:t>
+            </w:r>
+          </w:p>
+        </w:tc>
+      </w:tr>
+      <w:tr>
+        <w:tc>
+          <w:tcPr>
+            <w:tcW w:type="dxa" w:w="2536"/>
+          </w:tcPr>
+          <w:p>
+            <w:r>
+              <w:t>C2</w:t>
+            </w:r>
+          </w:p>
+        </w:tc>
+        <w:tc>
+          <w:tcPr>
+            <w:tcW w:type="dxa" w:w="2536"/>
+          </w:tcPr>
+          <w:p>
+            <w:r>
+              <w:t>seal_audit_v4.1.json</w:t>
+            </w:r>
+          </w:p>
+        </w:tc>
+        <w:tc>
+          <w:tcPr>
+            <w:tcW w:type="dxa" w:w="2536"/>
+          </w:tcPr>
+          <w:p>
+            <w:r>
+              <w:t>seal_revocation_record.json / leak_registry_patch.json / reseal_plan.json</w:t>
+            </w:r>
+          </w:p>
+        </w:tc>
+        <w:tc>
+          <w:tcPr>
+            <w:tcW w:type="dxa" w:w="2536"/>
+          </w:tcPr>
+          <w:p>
+            <w:r>
+              <w:t>Data-R</w:t>
+            </w:r>
+          </w:p>
+        </w:tc>
+      </w:tr>
+      <w:tr>
+        <w:tc>
+          <w:tcPr>
+            <w:tcW w:type="dxa" w:w="2536"/>
+          </w:tcPr>
+          <w:p>
+            <w:r>
+              <w:t>C3</w:t>
+            </w:r>
+          </w:p>
+        </w:tc>
+        <w:tc>
+          <w:tcPr>
+            <w:tcW w:type="dxa" w:w="2536"/>
+          </w:tcPr>
+          <w:p>
+            <w:r>
+              <w:t>tooling_bootstrap_report.json</w:t>
+            </w:r>
+          </w:p>
+        </w:tc>
+        <w:tc>
+          <w:tcPr>
+            <w:tcW w:type="dxa" w:w="2536"/>
+          </w:tcPr>
+          <w:p>
+            <w:r>
+              <w:t>P2-A PR / tests</w:t>
+            </w:r>
+          </w:p>
+        </w:tc>
+        <w:tc>
+          <w:tcPr>
+            <w:tcW w:type="dxa" w:w="2536"/>
+          </w:tcPr>
+          <w:p>
+            <w:r>
+              <w:t>Data-B + R</w:t>
+            </w:r>
+          </w:p>
+        </w:tc>
+      </w:tr>
+      <w:tr>
+        <w:tc>
+          <w:tcPr>
+            <w:tcW w:type="dxa" w:w="2536"/>
+          </w:tcPr>
+          <w:p>
+            <w:r>
+              <w:t>C4</w:t>
+            </w:r>
+          </w:p>
+        </w:tc>
+        <w:tc>
+          <w:tcPr>
+            <w:tcW w:type="dxa" w:w="2536"/>
+          </w:tcPr>
+          <w:p>
+            <w:r>
+              <w:t>trial40_reuse_audit.json</w:t>
+            </w:r>
+          </w:p>
+        </w:tc>
+        <w:tc>
+          <w:tcPr>
+            <w:tcW w:type="dxa" w:w="2536"/>
+          </w:tcPr>
+          <w:p>
+            <w:r>
+              <w:t>leak evidence</w:t>
+            </w:r>
+          </w:p>
+        </w:tc>
+        <w:tc>
+          <w:tcPr>
+            <w:tcW w:type="dxa" w:w="2536"/>
+          </w:tcPr>
+          <w:p>
+            <w:r>
+              <w:t>Data-R</w:t>
+            </w:r>
+          </w:p>
+        </w:tc>
+      </w:tr>
+      <w:tr>
+        <w:tc>
+          <w:tcPr>
+            <w:tcW w:type="dxa" w:w="2536"/>
+          </w:tcPr>
+          <w:p>
+            <w:r>
+              <w:t>C5</w:t>
+            </w:r>
+          </w:p>
+        </w:tc>
+        <w:tc>
+          <w:tcPr>
+            <w:tcW w:type="dxa" w:w="2536"/>
+          </w:tcPr>
+          <w:p>
+            <w:r>
+              <w:t>main_dependency_gate.json</w:t>
+            </w:r>
+          </w:p>
+        </w:tc>
+        <w:tc>
+          <w:tcPr>
+            <w:tcW w:type="dxa" w:w="2536"/>
+          </w:tcPr>
+          <w:p>
+            <w:r>
+              <w:t>interface package refs</w:t>
+            </w:r>
+          </w:p>
+        </w:tc>
+        <w:tc>
+          <w:tcPr>
+            <w:tcW w:type="dxa" w:w="2536"/>
+          </w:tcPr>
+          <w:p>
+            <w:r>
+              <w:t>Data-R</w:t>
+            </w:r>
+          </w:p>
+        </w:tc>
+      </w:tr>
+    </w:tbl>
     <w:p>
       <w:pPr>
         <w:pStyle w:val="Heading1"/>
@@ -9114,18 +9429,8 @@
             <w:vAlign w:val="center"/>
           </w:tcPr>
           <w:p>
-            <w:pPr>
-              <w:spacing w:after="0" w:before="0"/>
-              <w:jc w:val="left"/>
-            </w:pPr>
-            <w:r/>
-            <w:r>
-              <w:rPr>
-                <w:rFonts w:ascii="Noto Sans CJK SC" w:hAnsi="Noto Sans CJK SC" w:eastAsia="Noto Sans CJK SC"/>
-                <w:b w:val="0"/>
-                <w:sz w:val="17"/>
-              </w:rPr>
-              <w:t>Closure确认、M1、Legacy-N冻结、新40池</w:t>
+            <w:r>
+              <w:t>核验Closure freeze+C1 frozen inventory ref；执行M1 Gate；监督P10/P11 requalification；fresh40 pool planning(不提前抽blind)</w:t>
             </w:r>
           </w:p>
         </w:tc>
@@ -9141,18 +9446,8 @@
             <w:vAlign w:val="center"/>
           </w:tcPr>
           <w:p>
-            <w:pPr>
-              <w:spacing w:after="0" w:before="0"/>
-              <w:jc w:val="left"/>
-            </w:pPr>
-            <w:r/>
-            <w:r>
-              <w:rPr>
-                <w:rFonts w:ascii="Noto Sans CJK SC" w:hAnsi="Noto Sans CJK SC" w:eastAsia="Noto Sans CJK SC"/>
-                <w:b w:val="0"/>
-                <w:sz w:val="17"/>
-              </w:rPr>
-              <w:t>M1必须PASS</w:t>
+            <w:r>
+              <w:t>M1 D1 10:30 PASS</w:t>
             </w:r>
           </w:p>
         </w:tc>

</xml_diff>